<commit_message>
Real Engine - New Update!
</commit_message>
<xml_diff>
--- a/ChangeList/24.04.26.docx
+++ b/ChangeList/24.04.26.docx
@@ -99,315 +99,326 @@
       </w:r>
     </w:p>
     <w:p>
+      <w:r>
+        <w:t xml:space="preserve">- Улчшен и добавленны новые функции в </w:t>
+      </w:r>
+      <w:r>
+        <w:rPr>
+          <w:lang w:val="en-US"/>
+        </w:rPr>
+        <w:t>settings</w:t>
+      </w:r>
+      <w:r>
+        <w:t>_</w:t>
+      </w:r>
+      <w:r>
+        <w:rPr>
+          <w:lang w:val="en-US"/>
+        </w:rPr>
+        <w:t>migrator</w:t>
+      </w:r>
+      <w:r>
+        <w:t>.</w:t>
+      </w:r>
+      <w:r>
+        <w:rPr>
+          <w:lang w:val="en-US"/>
+        </w:rPr>
+        <w:t>cpp</w:t>
+      </w:r>
+      <w:r>
+        <w:t>/.</w:t>
+      </w:r>
+      <w:r>
+        <w:rPr>
+          <w:lang w:val="en-US"/>
+        </w:rPr>
+        <w:t>h</w:t>
+      </w:r>
+    </w:p>
+    <w:p>
+      <w:r>
+        <w:t>- Теперь токены сохраняются без ошибок</w:t>
+      </w:r>
+    </w:p>
+    <w:p>
+      <w:r>
+        <w:t>- Все настройки теперь сохраняются и мигрируют без ошибок и проблем</w:t>
+      </w:r>
+    </w:p>
+    <w:p>
+      <w:r>
+        <w:t>- Исправленна проблема панелей, когда они открывались одновременно и возникала проблема с синхронизацией окон</w:t>
+      </w:r>
+    </w:p>
+    <w:p>
+      <w:r>
+        <w:t>-</w:t>
+      </w:r>
+      <w:r>
+        <w:t xml:space="preserve"> </w:t>
+      </w:r>
+      <w:r>
+        <w:t xml:space="preserve">Добавленны новые </w:t>
+      </w:r>
+      <w:r>
+        <w:rPr>
+          <w:lang w:val="en-US"/>
+        </w:rPr>
+        <w:t>print</w:t>
+      </w:r>
+      <w:r>
+        <w:t>_</w:t>
+      </w:r>
+      <w:r>
+        <w:rPr>
+          <w:lang w:val="en-US"/>
+        </w:rPr>
+        <w:t>line</w:t>
+      </w:r>
+      <w:r>
+        <w:t>’</w:t>
+      </w:r>
+      <w:r>
+        <w:t xml:space="preserve">ы  и новые комментарии для тех, кто скачает исходный код </w:t>
+      </w:r>
+      <w:r>
+        <w:rPr>
+          <w:lang w:val="en-US"/>
+        </w:rPr>
+        <w:t>Real</w:t>
+      </w:r>
+      <w:r>
+        <w:t xml:space="preserve"> </w:t>
+      </w:r>
+      <w:r>
+        <w:rPr>
+          <w:lang w:val="en-US"/>
+        </w:rPr>
+        <w:t>Engine</w:t>
+      </w:r>
+    </w:p>
+    <w:p>
+      <w:r>
+        <w:t>-</w:t>
+      </w:r>
+      <w:r>
+        <w:t xml:space="preserve"> </w:t>
+      </w:r>
+      <w:r>
+        <w:t xml:space="preserve">Удаленны некоторые </w:t>
+      </w:r>
+      <w:r>
+        <w:rPr>
+          <w:lang w:val="en-US"/>
+        </w:rPr>
+        <w:t>print</w:t>
+      </w:r>
+      <w:r>
+        <w:t>_</w:t>
+      </w:r>
+      <w:r>
+        <w:rPr>
+          <w:lang w:val="en-US"/>
+        </w:rPr>
+        <w:t>line</w:t>
+      </w:r>
+      <w:r>
+        <w:t>’</w:t>
+      </w:r>
+      <w:r>
+        <w:t>ы чтобы не засорять код</w:t>
+      </w:r>
+    </w:p>
+    <w:p>
+      <w:r>
+        <w:t>-</w:t>
+      </w:r>
+      <w:r>
+        <w:t xml:space="preserve"> </w:t>
+      </w:r>
+      <w:r>
+        <w:t>Удаленны настройки для отдельной темы в настройках</w:t>
+      </w:r>
+    </w:p>
+    <w:p>
+      <w:r>
+        <w:t xml:space="preserve">- Удаленна функция </w:t>
+      </w:r>
+      <w:r>
+        <w:t>_</w:t>
+      </w:r>
+      <w:r>
+        <w:rPr>
+          <w:lang w:val="en-US"/>
+        </w:rPr>
+        <w:t>add</w:t>
+      </w:r>
+      <w:r>
+        <w:t>_</w:t>
+      </w:r>
+      <w:r>
+        <w:rPr>
+          <w:lang w:val="en-US"/>
+        </w:rPr>
+        <w:t>bottom</w:t>
+      </w:r>
+      <w:r>
+        <w:t>_</w:t>
+      </w:r>
+      <w:r>
+        <w:rPr>
+          <w:lang w:val="en-US"/>
+        </w:rPr>
+        <w:t>bar</w:t>
+      </w:r>
+      <w:r>
+        <w:t>, который так напрашивался удалиться</w:t>
+      </w:r>
+    </w:p>
+    <w:p>
+      <w:r>
+        <w:t xml:space="preserve">- Удаленна функция-баг, при котором если выключен </w:t>
+      </w:r>
+      <w:r>
+        <w:rPr>
+          <w:lang w:val="en-US"/>
+        </w:rPr>
+        <w:t>autosave</w:t>
+      </w:r>
+      <w:r>
+        <w:t xml:space="preserve">, то появлись миллиарды новый </w:t>
+      </w:r>
+      <w:r>
+        <w:rPr>
+          <w:lang w:val="en-US"/>
+        </w:rPr>
+        <w:t>Debug</w:t>
+      </w:r>
+      <w:r>
+        <w:t>’</w:t>
+      </w:r>
+      <w:r>
+        <w:t>ов, с надписью</w:t>
+      </w:r>
+      <w:r>
+        <w:t>: “</w:t>
+      </w:r>
+      <w:r>
+        <w:rPr>
+          <w:lang w:val="en-US"/>
+        </w:rPr>
+        <w:t>AutoSave</w:t>
+      </w:r>
+      <w:r>
+        <w:t xml:space="preserve"> </w:t>
+      </w:r>
+      <w:r>
+        <w:rPr>
+          <w:lang w:val="en-US"/>
+        </w:rPr>
+        <w:t>is</w:t>
+      </w:r>
+      <w:r>
+        <w:t xml:space="preserve"> </w:t>
+      </w:r>
+      <w:r>
+        <w:rPr>
+          <w:lang w:val="en-US"/>
+        </w:rPr>
+        <w:t>Off</w:t>
+      </w:r>
+      <w:r>
+        <w:t>”</w:t>
+      </w:r>
+    </w:p>
+    <w:p>
+      <w:r>
+        <w:t xml:space="preserve">- Улучшенна функция проверки отрицательныйх чисел в поле с </w:t>
+      </w:r>
+      <w:r>
+        <w:rPr>
+          <w:lang w:val="en-US"/>
+        </w:rPr>
+        <w:t>AutoSave</w:t>
+      </w:r>
+      <w:r>
+        <w:t>’</w:t>
+      </w:r>
+      <w:r>
+        <w:t xml:space="preserve">ом. Теперь вместо постоянного написания </w:t>
+      </w:r>
+      <w:r>
+        <w:t>“</w:t>
+      </w:r>
+      <w:r>
+        <w:rPr>
+          <w:lang w:val="en-US"/>
+        </w:rPr>
+        <w:t>AutoSave</w:t>
+      </w:r>
+      <w:r>
+        <w:t xml:space="preserve"> </w:t>
+      </w:r>
+      <w:r>
+        <w:rPr>
+          <w:lang w:val="en-US"/>
+        </w:rPr>
+        <w:t>Interval</w:t>
+      </w:r>
+      <w:r>
+        <w:t xml:space="preserve"> </w:t>
+      </w:r>
+      <w:r>
+        <w:rPr>
+          <w:lang w:val="en-US"/>
+        </w:rPr>
+        <w:t>Cannot</w:t>
+      </w:r>
+      <w:r>
+        <w:t xml:space="preserve"> </w:t>
+      </w:r>
+      <w:r>
+        <w:rPr>
+          <w:lang w:val="en-US"/>
+        </w:rPr>
+        <w:t>be</w:t>
+      </w:r>
+      <w:r>
+        <w:t xml:space="preserve"> </w:t>
+      </w:r>
+      <w:r>
+        <w:rPr>
+          <w:lang w:val="en-US"/>
+        </w:rPr>
+        <w:t>negative</w:t>
+      </w:r>
+      <w:r>
+        <w:t>”</w:t>
+      </w:r>
+      <w:r>
+        <w:t>, появляется просто одна надпись в Консоли</w:t>
+      </w:r>
+    </w:p>
+    <w:p/>
+    <w:p>
       <w:pPr>
         <w:rPr>
-          <w:lang w:val="en-US"/>
+          <w:b/>
         </w:rPr>
       </w:pPr>
       <w:r>
-        <w:t xml:space="preserve">- Улчшен и добавленны новые функции в </w:t>
-      </w:r>
-      <w:r>
-        <w:rPr>
-          <w:lang w:val="en-US"/>
-        </w:rPr>
-        <w:t>settings</w:t>
-      </w:r>
-      <w:r>
-        <w:t>_</w:t>
-      </w:r>
-      <w:r>
-        <w:rPr>
-          <w:lang w:val="en-US"/>
-        </w:rPr>
-        <w:t>migrator</w:t>
-      </w:r>
-      <w:r>
-        <w:t>.</w:t>
-      </w:r>
-      <w:r>
-        <w:rPr>
-          <w:lang w:val="en-US"/>
-        </w:rPr>
-        <w:t>cpp</w:t>
-      </w:r>
-      <w:r>
-        <w:t>/.</w:t>
-      </w:r>
-      <w:r>
-        <w:rPr>
-          <w:lang w:val="en-US"/>
-        </w:rPr>
-        <w:t>h</w:t>
-      </w:r>
-    </w:p>
-    <w:p>
-      <w:r>
-        <w:t>- Теперь токены сохраняются без ошибок</w:t>
-      </w:r>
-    </w:p>
-    <w:p>
-      <w:r>
-        <w:t>- Все настройки теперь сохраняются и мигрируют без ошибок и проблем</w:t>
-      </w:r>
-    </w:p>
-    <w:p>
-      <w:pPr>
-        <w:rPr>
-          <w:lang w:val="en-US"/>
-        </w:rPr>
-      </w:pPr>
-      <w:r>
-        <w:t>- Исправленна проблема панелей, когда они открывались одновременно и возникала проблема с синхронизацией окон</w:t>
-      </w:r>
-    </w:p>
-    <w:p>
-      <w:r>
-        <w:t>-</w:t>
-      </w:r>
-      <w:r>
-        <w:t xml:space="preserve"> </w:t>
-      </w:r>
-      <w:r>
-        <w:t xml:space="preserve">Добавленны новые </w:t>
-      </w:r>
-      <w:r>
-        <w:rPr>
-          <w:lang w:val="en-US"/>
-        </w:rPr>
-        <w:t>print</w:t>
-      </w:r>
-      <w:r>
-        <w:t>_</w:t>
-      </w:r>
-      <w:r>
-        <w:rPr>
-          <w:lang w:val="en-US"/>
-        </w:rPr>
-        <w:t>line</w:t>
-      </w:r>
-      <w:r>
-        <w:t>’</w:t>
-      </w:r>
-      <w:r>
-        <w:t xml:space="preserve">ы  и новые комментарии для тех, кто скачает исходный код </w:t>
-      </w:r>
-      <w:r>
-        <w:rPr>
-          <w:lang w:val="en-US"/>
-        </w:rPr>
-        <w:t>Real</w:t>
-      </w:r>
-      <w:r>
-        <w:t xml:space="preserve"> </w:t>
-      </w:r>
-      <w:r>
-        <w:rPr>
-          <w:lang w:val="en-US"/>
-        </w:rPr>
-        <w:t>Engine</w:t>
-      </w:r>
-    </w:p>
-    <w:p>
-      <w:r>
-        <w:t>-</w:t>
-      </w:r>
-      <w:r>
-        <w:t xml:space="preserve"> </w:t>
-      </w:r>
-      <w:r>
-        <w:t xml:space="preserve">Удаленны некоторые </w:t>
-      </w:r>
-      <w:r>
-        <w:rPr>
-          <w:lang w:val="en-US"/>
-        </w:rPr>
-        <w:t>print</w:t>
-      </w:r>
-      <w:r>
-        <w:t>_</w:t>
-      </w:r>
-      <w:r>
-        <w:rPr>
-          <w:lang w:val="en-US"/>
-        </w:rPr>
-        <w:t>line</w:t>
-      </w:r>
-      <w:r>
-        <w:t>’</w:t>
-      </w:r>
-      <w:r>
-        <w:t>ы чтобы не засорять код</w:t>
-      </w:r>
-    </w:p>
-    <w:p>
-      <w:r>
-        <w:t>-</w:t>
-      </w:r>
-      <w:r>
-        <w:t xml:space="preserve"> </w:t>
-      </w:r>
-      <w:r>
-        <w:t>Удаленны настройки для отдельной темы в настройках</w:t>
-      </w:r>
-    </w:p>
-    <w:p>
-      <w:r>
-        <w:t xml:space="preserve">- Удаленна функция </w:t>
-      </w:r>
-      <w:r>
-        <w:t>_</w:t>
-      </w:r>
-      <w:r>
-        <w:rPr>
-          <w:lang w:val="en-US"/>
-        </w:rPr>
-        <w:t>add</w:t>
-      </w:r>
-      <w:r>
-        <w:t>_</w:t>
-      </w:r>
-      <w:r>
-        <w:rPr>
-          <w:lang w:val="en-US"/>
-        </w:rPr>
-        <w:t>bottom</w:t>
-      </w:r>
-      <w:r>
-        <w:t>_</w:t>
-      </w:r>
-      <w:r>
-        <w:rPr>
-          <w:lang w:val="en-US"/>
-        </w:rPr>
-        <w:t>bar</w:t>
-      </w:r>
-      <w:r>
-        <w:t>, который так напрашивался удалиться</w:t>
-      </w:r>
-    </w:p>
-    <w:p>
-      <w:r>
-        <w:t xml:space="preserve">- Удаленна функция-баг, при котором если выключен </w:t>
-      </w:r>
-      <w:r>
-        <w:rPr>
-          <w:lang w:val="en-US"/>
-        </w:rPr>
-        <w:t>autosave</w:t>
-      </w:r>
-      <w:r>
-        <w:t xml:space="preserve">, то появлись миллиарды новый </w:t>
-      </w:r>
-      <w:r>
-        <w:rPr>
-          <w:lang w:val="en-US"/>
-        </w:rPr>
-        <w:t>Debug</w:t>
-      </w:r>
-      <w:r>
-        <w:t>’</w:t>
-      </w:r>
-      <w:r>
-        <w:t>ов, с надписью</w:t>
-      </w:r>
-      <w:r>
-        <w:t>: “</w:t>
-      </w:r>
-      <w:r>
-        <w:rPr>
-          <w:lang w:val="en-US"/>
-        </w:rPr>
-        <w:t>AutoSave</w:t>
-      </w:r>
-      <w:r>
-        <w:t xml:space="preserve"> </w:t>
-      </w:r>
-      <w:r>
-        <w:rPr>
-          <w:lang w:val="en-US"/>
-        </w:rPr>
-        <w:t>is</w:t>
-      </w:r>
-      <w:r>
-        <w:t xml:space="preserve"> </w:t>
-      </w:r>
-      <w:r>
-        <w:rPr>
-          <w:lang w:val="en-US"/>
-        </w:rPr>
-        <w:t>Off</w:t>
-      </w:r>
-      <w:r>
-        <w:t>”</w:t>
-      </w:r>
-    </w:p>
-    <w:p>
-      <w:r>
-        <w:t xml:space="preserve">- Улучшенна функция проверки отрицательныйх чисел в поле с </w:t>
-      </w:r>
-      <w:r>
-        <w:rPr>
-          <w:lang w:val="en-US"/>
-        </w:rPr>
-        <w:t>AutoSave</w:t>
-      </w:r>
-      <w:r>
-        <w:t>’</w:t>
-      </w:r>
-      <w:r>
-        <w:t xml:space="preserve">ом. Теперь вместо постоянного написания </w:t>
-      </w:r>
-      <w:r>
-        <w:t>“</w:t>
-      </w:r>
-      <w:r>
-        <w:rPr>
-          <w:lang w:val="en-US"/>
-        </w:rPr>
-        <w:t>AutoSave</w:t>
-      </w:r>
-      <w:r>
-        <w:t xml:space="preserve"> </w:t>
-      </w:r>
-      <w:r>
-        <w:rPr>
-          <w:lang w:val="en-US"/>
-        </w:rPr>
-        <w:t>Interval</w:t>
-      </w:r>
-      <w:r>
-        <w:t xml:space="preserve"> </w:t>
-      </w:r>
-      <w:r>
-        <w:rPr>
-          <w:lang w:val="en-US"/>
-        </w:rPr>
-        <w:t>Cannot</w:t>
-      </w:r>
-      <w:r>
-        <w:t xml:space="preserve"> </w:t>
-      </w:r>
-      <w:r>
-        <w:rPr>
-          <w:lang w:val="en-US"/>
-        </w:rPr>
-        <w:t>be</w:t>
-      </w:r>
-      <w:r>
-        <w:t xml:space="preserve"> </w:t>
-      </w:r>
-      <w:r>
-        <w:rPr>
-          <w:lang w:val="en-US"/>
-        </w:rPr>
-        <w:t>negative</w:t>
-      </w:r>
-      <w:r>
-        <w:t>”</w:t>
-      </w:r>
-      <w:r>
-        <w:t>, появляется просто одна надпись в Консоли</w:t>
+        <w:rPr>
+          <w:b/>
+          <w:lang w:val="en-US"/>
+        </w:rPr>
+        <w:t>(</w:t>
+      </w:r>
+      <w:r>
+        <w:rPr>
+          <w:b/>
+        </w:rPr>
+        <w:t>Всего – 13)</w:t>
       </w:r>
       <w:bookmarkStart w:id="0" w:name="_GoBack"/>
       <w:bookmarkEnd w:id="0"/>
@@ -1201,7 +1212,7 @@
 </file>
 
 <file path=customXml/itemProps1.xml><?xml version="1.0" encoding="utf-8"?>
-<ds:datastoreItem xmlns:ds="http://schemas.openxmlformats.org/officeDocument/2006/customXml" ds:itemID="{10F2F874-A42D-4CB9-B96A-8C47C28D6225}">
+<ds:datastoreItem xmlns:ds="http://schemas.openxmlformats.org/officeDocument/2006/customXml" ds:itemID="{33CB9B0E-B948-46E2-ADF7-6C646ED18E64}">
   <ds:schemaRefs>
     <ds:schemaRef ds:uri="http://schemas.openxmlformats.org/officeDocument/2006/bibliography"/>
   </ds:schemaRefs>

</xml_diff>